<commit_message>
feat: Prophet ML forecasting + full documentation update
Pipeline:
- 06_ML_Predictions.py: Facebook Prophet revenue forecast per category,
  6-month forward predictions written to GOLD.ML_REVENUE_FORECAST
- 05_Master_Orchestrator.py: added t06 ML step after dbt transform
- docker-compose.example.yaml: added prophet to pip install

Documentation (ENG + CZ):
- README.md / README_CZ.md: DE+DA+ML framing, Prophet in tech stack,
  forecast step added to pipeline description
- Documentation ENG 5.0.docx / Pitch ENG 5.0.docx: ML section added,
  Pitch updated to show forecasting as IMPLEMENTED
- Dokumentace CZ 5.0.docx / Pitch CZ 5.0.docx: same in Czech
</commit_message>
<xml_diff>
--- a/Documentation CZ/Dokumentace CZ 5.0.docx
+++ b/Documentation CZ/Dokumentace CZ 5.0.docx
@@ -35,12 +35,12 @@
     </w:p>
     <w:p>
       <w:r>
-        <w:t>Alfa Stream je osobní portfolio projekt, který jsem navrhl a postavil celý od základů jako ukázku komplexního end-to-end datového projektu — kombinující datové inženýrství a datovou analytiku v jedné platformě.</w:t>
+        <w:t>Alfa Stream je osobní portfolio projekt, který jsem navrhl a postavil celý od základů jako ukázku komplexního end-to-end datového projektu — kombinující datové inženýrství, datovou analytiku a strojové učení v jedné platformě.</w:t>
       </w:r>
     </w:p>
     <w:p>
       <w:r>
-        <w:t>Projekt pokrývá celý datový životní cyklus: simulace zdrojových dat, orchestrace pipeline, cloud warehouse, transformační modelování a analytická vrstva s byznysovými dashboardy. Platforma simuluje reálný e-commerce provoz — zákazníci procházejí katalogem, přidávají produkty do košíku, vytvářejí objednávky, zaměstnanci přidávají doplňkové služby. Vše automaticky protéká vícevrstvou pipeline do Snowflake, kde Power BI dashboardy zobrazují byznysové výstupy.</w:t>
+        <w:t>Projekt pokrývá celý datový životní cyklus: simulace zdrojových dat, orchestrace pipeline, cloud warehouse, transformační modelování, analytická vrstva s byznysovými dashboardy a integrovaná ML predikční vrstva.</w:t>
       </w:r>
     </w:p>
     <w:p>
@@ -53,7 +53,7 @@
     </w:p>
     <w:p>
       <w:r>
-        <w:t>Systém je organizován do čtyř vrstev:</w:t>
+        <w:t>Systém je organizován do pěti vrstev:</w:t>
       </w:r>
     </w:p>
     <w:p>
@@ -116,7 +116,7 @@
     </w:p>
     <w:p>
       <w:r>
-        <w:t>00_HR_Gen → 01A_Products → 01B_Traffic → 01C_Orders → 02_Postgres_Load → 03_Snowflake_Sync → 04_dbt_Transform</w:t>
+        <w:t>00_HR_Gen → 01A_Products → 01B_Traffic → 01C_Orders → 02_Postgres_Load → 03_Snowflake_Sync → 04_dbt_Transform → 06_ML_Predictions</w:t>
       </w:r>
     </w:p>
     <w:p>
@@ -356,6 +356,393 @@
     </w:p>
     <w:p>
       <w:pPr>
+        <w:pStyle w:val="Heading2"/>
+      </w:pPr>
+      <w:r>
+        <w:t>5. ML Predikce (Facebook Prophet)</w:t>
+      </w:r>
+    </w:p>
+    <w:p>
+      <w:r>
+        <w:t>DAG 06 běží automaticky po každém dbt transformačním cyklu. Načítá měsíční data o příjmech z GOLD.MART_MONTHLY_PRODUCT_SALES, trénuje samostatný Prophet model pro každou kategorii produktu (plus jeden agregovaný model pro celkové příjmy) a zapisuje 6měsíční predikce zpět do Snowflake jako GOLD.ML_REVENUE_FORECAST.</w:t>
+      </w:r>
+    </w:p>
+    <w:p>
+      <w:r>
+        <w:t>Konfigurace Prophet:</w:t>
+      </w:r>
+    </w:p>
+    <w:p>
+      <w:pPr>
+        <w:pStyle w:val="ListBullet"/>
+      </w:pPr>
+      <w:r>
+        <w:t>Roční sezónnost povolena — zachycuje roční vzorce příjmů</w:t>
+      </w:r>
+    </w:p>
+    <w:p>
+      <w:pPr>
+        <w:pStyle w:val="ListBullet"/>
+      </w:pPr>
+      <w:r>
+        <w:t>Multiplikativní sezónnost — správná pro data s rostoucím trendem příjmů</w:t>
+      </w:r>
+    </w:p>
+    <w:p>
+      <w:pPr>
+        <w:pStyle w:val="ListBullet"/>
+      </w:pPr>
+      <w:r>
+        <w:t>95% interval spolehlivosti (yhat_lower / yhat_upper)</w:t>
+      </w:r>
+    </w:p>
+    <w:p>
+      <w:pPr>
+        <w:pStyle w:val="ListBullet"/>
+      </w:pPr>
+      <w:r>
+        <w:t>Minimálně 12 měsíců historie vyžadováno pro každou kategorii</w:t>
+      </w:r>
+    </w:p>
+    <w:p>
+      <w:r>
+        <w:t>Výstupní tabulka: GOLD.ML_REVENUE_FORECAST</w:t>
+      </w:r>
+    </w:p>
+    <w:tbl>
+      <w:tblPr>
+        <w:tblStyle w:val="TableGrid"/>
+        <w:tblW w:type="auto" w:w="0"/>
+        <w:tblLook w:firstColumn="1" w:firstRow="1" w:lastColumn="0" w:lastRow="0" w:noHBand="0" w:noVBand="1" w:val="04A0"/>
+      </w:tblPr>
+      <w:tblGrid>
+        <w:gridCol w:w="2880"/>
+        <w:gridCol w:w="2880"/>
+        <w:gridCol w:w="2880"/>
+      </w:tblGrid>
+      <w:tr>
+        <w:tc>
+          <w:tcPr>
+            <w:tcW w:type="dxa" w:w="2880"/>
+          </w:tcPr>
+          <w:p>
+            <w:r>
+              <w:t>Sloupec</w:t>
+            </w:r>
+          </w:p>
+        </w:tc>
+        <w:tc>
+          <w:tcPr>
+            <w:tcW w:type="dxa" w:w="2880"/>
+          </w:tcPr>
+          <w:p>
+            <w:r>
+              <w:t>Typ</w:t>
+            </w:r>
+          </w:p>
+        </w:tc>
+        <w:tc>
+          <w:tcPr>
+            <w:tcW w:type="dxa" w:w="2880"/>
+          </w:tcPr>
+          <w:p>
+            <w:r>
+              <w:t>Popis</w:t>
+            </w:r>
+          </w:p>
+        </w:tc>
+      </w:tr>
+      <w:tr>
+        <w:tc>
+          <w:tcPr>
+            <w:tcW w:type="dxa" w:w="2880"/>
+          </w:tcPr>
+          <w:p>
+            <w:r>
+              <w:t>FORECAST_ID</w:t>
+            </w:r>
+          </w:p>
+        </w:tc>
+        <w:tc>
+          <w:tcPr>
+            <w:tcW w:type="dxa" w:w="2880"/>
+          </w:tcPr>
+          <w:p>
+            <w:r>
+              <w:t>string</w:t>
+            </w:r>
+          </w:p>
+        </w:tc>
+        <w:tc>
+          <w:tcPr>
+            <w:tcW w:type="dxa" w:w="2880"/>
+          </w:tcPr>
+          <w:p>
+            <w:r>
+              <w:t>Unikátní identifikátor řádku (UUID)</w:t>
+            </w:r>
+          </w:p>
+        </w:tc>
+      </w:tr>
+      <w:tr>
+        <w:tc>
+          <w:tcPr>
+            <w:tcW w:type="dxa" w:w="2880"/>
+          </w:tcPr>
+          <w:p>
+            <w:r>
+              <w:t>FORECAST_DATE</w:t>
+            </w:r>
+          </w:p>
+        </w:tc>
+        <w:tc>
+          <w:tcPr>
+            <w:tcW w:type="dxa" w:w="2880"/>
+          </w:tcPr>
+          <w:p>
+            <w:r>
+              <w:t>date</w:t>
+            </w:r>
+          </w:p>
+        </w:tc>
+        <w:tc>
+          <w:tcPr>
+            <w:tcW w:type="dxa" w:w="2880"/>
+          </w:tcPr>
+          <w:p>
+            <w:r>
+              <w:t>Predikovaný měsíc</w:t>
+            </w:r>
+          </w:p>
+        </w:tc>
+      </w:tr>
+      <w:tr>
+        <w:tc>
+          <w:tcPr>
+            <w:tcW w:type="dxa" w:w="2880"/>
+          </w:tcPr>
+          <w:p>
+            <w:r>
+              <w:t>CATEGORY</w:t>
+            </w:r>
+          </w:p>
+        </w:tc>
+        <w:tc>
+          <w:tcPr>
+            <w:tcW w:type="dxa" w:w="2880"/>
+          </w:tcPr>
+          <w:p>
+            <w:r>
+              <w:t>string</w:t>
+            </w:r>
+          </w:p>
+        </w:tc>
+        <w:tc>
+          <w:tcPr>
+            <w:tcW w:type="dxa" w:w="2880"/>
+          </w:tcPr>
+          <w:p>
+            <w:r>
+              <w:t>Kategorie produktu nebo ALL pro celkové</w:t>
+            </w:r>
+          </w:p>
+        </w:tc>
+      </w:tr>
+      <w:tr>
+        <w:tc>
+          <w:tcPr>
+            <w:tcW w:type="dxa" w:w="2880"/>
+          </w:tcPr>
+          <w:p>
+            <w:r>
+              <w:t>REVENUE_ACTUAL</w:t>
+            </w:r>
+          </w:p>
+        </w:tc>
+        <w:tc>
+          <w:tcPr>
+            <w:tcW w:type="dxa" w:w="2880"/>
+          </w:tcPr>
+          <w:p>
+            <w:r>
+              <w:t>float</w:t>
+            </w:r>
+          </w:p>
+        </w:tc>
+        <w:tc>
+          <w:tcPr>
+            <w:tcW w:type="dxa" w:w="2880"/>
+          </w:tcPr>
+          <w:p>
+            <w:r>
+              <w:t>Historická skutečnost (NULL pro budoucí měsíce)</w:t>
+            </w:r>
+          </w:p>
+        </w:tc>
+      </w:tr>
+      <w:tr>
+        <w:tc>
+          <w:tcPr>
+            <w:tcW w:type="dxa" w:w="2880"/>
+          </w:tcPr>
+          <w:p>
+            <w:r>
+              <w:t>REVENUE_FORECAST</w:t>
+            </w:r>
+          </w:p>
+        </w:tc>
+        <w:tc>
+          <w:tcPr>
+            <w:tcW w:type="dxa" w:w="2880"/>
+          </w:tcPr>
+          <w:p>
+            <w:r>
+              <w:t>float</w:t>
+            </w:r>
+          </w:p>
+        </w:tc>
+        <w:tc>
+          <w:tcPr>
+            <w:tcW w:type="dxa" w:w="2880"/>
+          </w:tcPr>
+          <w:p>
+            <w:r>
+              <w:t>Bodová predikce Prophet (yhat)</w:t>
+            </w:r>
+          </w:p>
+        </w:tc>
+      </w:tr>
+      <w:tr>
+        <w:tc>
+          <w:tcPr>
+            <w:tcW w:type="dxa" w:w="2880"/>
+          </w:tcPr>
+          <w:p>
+            <w:r>
+              <w:t>REVENUE_LOWER</w:t>
+            </w:r>
+          </w:p>
+        </w:tc>
+        <w:tc>
+          <w:tcPr>
+            <w:tcW w:type="dxa" w:w="2880"/>
+          </w:tcPr>
+          <w:p>
+            <w:r>
+              <w:t>float</w:t>
+            </w:r>
+          </w:p>
+        </w:tc>
+        <w:tc>
+          <w:tcPr>
+            <w:tcW w:type="dxa" w:w="2880"/>
+          </w:tcPr>
+          <w:p>
+            <w:r>
+              <w:t>Dolní mez 95% intervalu spolehlivosti</w:t>
+            </w:r>
+          </w:p>
+        </w:tc>
+      </w:tr>
+      <w:tr>
+        <w:tc>
+          <w:tcPr>
+            <w:tcW w:type="dxa" w:w="2880"/>
+          </w:tcPr>
+          <w:p>
+            <w:r>
+              <w:t>REVENUE_UPPER</w:t>
+            </w:r>
+          </w:p>
+        </w:tc>
+        <w:tc>
+          <w:tcPr>
+            <w:tcW w:type="dxa" w:w="2880"/>
+          </w:tcPr>
+          <w:p>
+            <w:r>
+              <w:t>float</w:t>
+            </w:r>
+          </w:p>
+        </w:tc>
+        <w:tc>
+          <w:tcPr>
+            <w:tcW w:type="dxa" w:w="2880"/>
+          </w:tcPr>
+          <w:p>
+            <w:r>
+              <w:t>Horní mez 95% intervalu spolehlivosti</w:t>
+            </w:r>
+          </w:p>
+        </w:tc>
+      </w:tr>
+      <w:tr>
+        <w:tc>
+          <w:tcPr>
+            <w:tcW w:type="dxa" w:w="2880"/>
+          </w:tcPr>
+          <w:p>
+            <w:r>
+              <w:t>IS_FUTURE</w:t>
+            </w:r>
+          </w:p>
+        </w:tc>
+        <w:tc>
+          <w:tcPr>
+            <w:tcW w:type="dxa" w:w="2880"/>
+          </w:tcPr>
+          <w:p>
+            <w:r>
+              <w:t>boolean</w:t>
+            </w:r>
+          </w:p>
+        </w:tc>
+        <w:tc>
+          <w:tcPr>
+            <w:tcW w:type="dxa" w:w="2880"/>
+          </w:tcPr>
+          <w:p>
+            <w:r>
+              <w:t>True pro řádky pouze s predikcí</w:t>
+            </w:r>
+          </w:p>
+        </w:tc>
+      </w:tr>
+      <w:tr>
+        <w:tc>
+          <w:tcPr>
+            <w:tcW w:type="dxa" w:w="2880"/>
+          </w:tcPr>
+          <w:p>
+            <w:r>
+              <w:t>GENERATED_AT</w:t>
+            </w:r>
+          </w:p>
+        </w:tc>
+        <w:tc>
+          <w:tcPr>
+            <w:tcW w:type="dxa" w:w="2880"/>
+          </w:tcPr>
+          <w:p>
+            <w:r>
+              <w:t>timestamp</w:t>
+            </w:r>
+          </w:p>
+        </w:tc>
+        <w:tc>
+          <w:tcPr>
+            <w:tcW w:type="dxa" w:w="2880"/>
+          </w:tcPr>
+          <w:p>
+            <w:r>
+              <w:t>Čas dokončení běhu modelu</w:t>
+            </w:r>
+          </w:p>
+        </w:tc>
+      </w:tr>
+    </w:tbl>
+    <w:p>
+      <w:pPr>
         <w:pStyle w:val="Heading1"/>
       </w:pPr>
       <w:r>
@@ -392,6 +779,14 @@
       </w:pPr>
       <w:r>
         <w:t>Nejnovější měsíc je vždy znovu zpracován kvůli průběžným datům (&gt;= MAX(period_column))</w:t>
+      </w:r>
+    </w:p>
+    <w:p>
+      <w:pPr>
+        <w:pStyle w:val="ListBullet"/>
+      </w:pPr>
+      <w:r>
+        <w:t>ML_REVENUE_FORECAST je plně obnoven při každém běhu — predikce se mění s příchodem nových dat</w:t>
       </w:r>
     </w:p>
     <w:p>
@@ -587,7 +982,7 @@
         <w:pStyle w:val="Heading2"/>
       </w:pPr>
       <w:r>
-        <w:t>Fakt a marty (DirectQuery v Power BI)</w:t>
+        <w:t>Fakta, Marty a ML (DirectQuery v Power BI)</w:t>
       </w:r>
     </w:p>
     <w:tbl>
@@ -793,6 +1188,38 @@
           </w:p>
         </w:tc>
       </w:tr>
+      <w:tr>
+        <w:tc>
+          <w:tcPr>
+            <w:tcW w:type="dxa" w:w="2880"/>
+          </w:tcPr>
+          <w:p>
+            <w:r>
+              <w:t>ml_revenue_forecast</w:t>
+            </w:r>
+          </w:p>
+        </w:tc>
+        <w:tc>
+          <w:tcPr>
+            <w:tcW w:type="dxa" w:w="2880"/>
+          </w:tcPr>
+          <w:p>
+            <w:r>
+              <w:t>měsíc × kategorie</w:t>
+            </w:r>
+          </w:p>
+        </w:tc>
+        <w:tc>
+          <w:tcPr>
+            <w:tcW w:type="dxa" w:w="2880"/>
+          </w:tcPr>
+          <w:p>
+            <w:r>
+              <w:t>revenue_forecast, revenue_lower, revenue_upper, is_future</w:t>
+            </w:r>
+          </w:p>
+        </w:tc>
+      </w:tr>
     </w:tbl>
     <w:p>
       <w:pPr>
@@ -966,6 +1393,28 @@
           </w:p>
         </w:tc>
       </w:tr>
+      <w:tr>
+        <w:tc>
+          <w:tcPr>
+            <w:tcW w:type="dxa" w:w="4320"/>
+          </w:tcPr>
+          <w:p>
+            <w:r>
+              <w:t>ML / Predikce</w:t>
+            </w:r>
+          </w:p>
+        </w:tc>
+        <w:tc>
+          <w:tcPr>
+            <w:tcW w:type="dxa" w:w="4320"/>
+          </w:tcPr>
+          <w:p>
+            <w:r>
+              <w:t>Python — Facebook Prophet</w:t>
+            </w:r>
+          </w:p>
+        </w:tc>
+      </w:tr>
     </w:tbl>
     <w:p>
       <w:pPr>
@@ -1007,12 +1456,12 @@
     </w:p>
     <w:p>
       <w:r>
-        <w:t>Airflow UI → http://localhost:8082  (admin / admin)</w:t>
+        <w:t>Celá pipeline: Airflow UI → http://localhost:8082  (admin / admin)</w:t>
       </w:r>
     </w:p>
     <w:p>
       <w:r>
-        <w:t>DAG: 05_Master_Orchestrator → spustit manuálně</w:t>
+        <w:t>DAG: 05_Master_Orchestrator → spustit manuálně (spustí všechny DAGy včetně ML)</w:t>
       </w:r>
     </w:p>
     <w:sectPr>

</xml_diff>

<commit_message>
feat: add ML anomaly detection and traffic prediction (v5.0 complete)
- DAG 06 expanded with Z-score anomaly detection (GOLD.ML_ANOMALY_FLAGS)
  and Ridge Regression traffic pattern prediction (GOLD.ML_TRAFFIC_PREDICTION);
  all three ML tasks run in parallel in Airflow
- Power BI semantic model: new ML_ANOMALY_FLAGS and ML_TRAFFIC_PREDICTION
  table definitions, refs in model.tmdl, PERIOD→DIM_DATE relationship
- mart_monthly_product_sales: add PRODUCT_ID column to GROUP BY for
  proper product-level aggregation
- docker-compose.example.yaml: add scikit-learn to pip install
- README (ENG + CZ): update step 6, tech stack, repo structure, and
  Gold layer table list to reflect all three ML models
- All four documentation files (ENG/CZ docs + pitches): ML section
  expanded; anomaly detection and traffic prediction marked IMPLEMENTED
</commit_message>
<xml_diff>
--- a/Documentation CZ/Dokumentace CZ 5.0.docx
+++ b/Documentation CZ/Dokumentace CZ 5.0.docx
@@ -359,17 +359,32 @@
         <w:pStyle w:val="Heading2"/>
       </w:pPr>
       <w:r>
-        <w:t>5. ML Predikce (Facebook Prophet)</w:t>
+        <w:t>5. Vrstva ML predikcí</w:t>
       </w:r>
     </w:p>
     <w:p>
       <w:r>
-        <w:t>DAG 06 běží automaticky po každém dbt transformačním cyklu. Načítá měsíční data o příjmech z GOLD.MART_MONTHLY_PRODUCT_SALES, trénuje samostatný Prophet model pro každou kategorii produktu (plus jeden agregovaný model pro celkové příjmy) a zapisuje 6měsíční predikce zpět do Snowflake jako GOLD.ML_REVENUE_FORECAST.</w:t>
+        <w:t>DAG 06 běží automaticky po každém dbt transformačním cyklu jako tři nezávislé paralelní tasky:</w:t>
+        <w:br/>
+        <w:br/>
+        <w:t>5a. Predikce příjmů (Facebook Prophet)</w:t>
+        <w:br/>
+        <w:t>Načítá měsíční data z GOLD.MART_MONTHLY_PRODUCT_SALES a trénuje samostatný Prophet model pro každou kategorii produktu plus celkový ALL rollup. Předpovídá příjmy na následujících 6 měsíců s 95% intervalem spolehlivosti.</w:t>
+        <w:br/>
+        <w:br/>
+        <w:t>5b. Detekce anomálií (Z-score)</w:t>
+        <w:br/>
+        <w:t>Načítá konverzní míry produktů z MART_TRAFFIC_CONVERSION_BY_PRODUCT a attach rate addonů zaměstnanců z MART_EMPLOYEE_ADDON_PERFORMANCE. Pro každou entitu vypočítá historický průměr a směrodatnou odchylku a označí jako anomálii každé období, kde |Z-score| &gt; 2,0 — se směrem (HIGH / LOW).</w:t>
+        <w:br/>
+        <w:br/>
+        <w:t>5c. Predikce vzorců trafficu (Ridge Regression)</w:t>
+        <w:br/>
+        <w:t>Načítá historická hodinová data z MART_HOURLY_TRAFFIC_CONVERSION a trénuje Ridge Regression model s OneHotEncoderem na hodinu dne a den v týdnu. Výstupem jsou předpovězené počty návštěv pro všech 168 kombinací hodina × den._PRODUCT_SALES, trénuje samostatný Prophet model pro každou kategorii produktu (plus jeden agregovaný model pro celkové příjmy) a zapisuje 6měsíční predikce zpět do Snowflake jako GOLD.ML_REVENUE_FORECAST.</w:t>
       </w:r>
     </w:p>
     <w:p>
       <w:r>
-        <w:t>Konfigurace Prophet:</w:t>
+        <w:t>Konfigurace Prophet (predikce příjmů):</w:t>
       </w:r>
     </w:p>
     <w:p>
@@ -406,7 +421,13 @@
     </w:p>
     <w:p>
       <w:r>
-        <w:t>Výstupní tabulka: GOLD.ML_REVENUE_FORECAST</w:t>
+        <w:t>Výstupní tabulky:</w:t>
+        <w:br/>
+        <w:t xml:space="preserve">  GOLD.ML_REVENUE_FORECAST — predikce příjmů podle kategorie (6 měsíců dopředu)</w:t>
+        <w:br/>
+        <w:t xml:space="preserve">  GOLD.ML_ANOMALY_FLAGS — Z-score anomálie podle entity a období</w:t>
+        <w:br/>
+        <w:t xml:space="preserve">  GOLD.ML_TRAFFIC_PREDICTION — předpovězený počet návštěv pro každou kombinaci hodina × den</w:t>
       </w:r>
     </w:p>
     <w:tbl>
@@ -786,7 +807,7 @@
         <w:pStyle w:val="ListBullet"/>
       </w:pPr>
       <w:r>
-        <w:t>ML_REVENUE_FORECAST je plně obnoven při každém běhu — predikce se mění s příchodem nových dat</w:t>
+        <w:t>Všechny tři ML výstupní tabulky (ML_REVENUE_FORECAST, ML_ANOMALY_FLAGS, ML_TRAFFIC_PREDICTION) jsou plně obnoveny při každém běhu — predikce se mění s příchodem nových dat</w:t>
       </w:r>
     </w:p>
     <w:p>

</xml_diff>

<commit_message>
feat: add mart_city_sales, mart_product_reviews, avg_review_score to dim_products_gold; update docs - New dbt models: mart_city_sales (city × day grain), mart_product_reviews (month × product grain) - dim_products_gold: joined avg_review_score from fact_orders_gold via weighted AVG - Documentation (ENG + CZ): filled Power BI section, updated data model tables (dim_date 2021–2031,   dim_products_gold new columns, added mart_city_sales, mart_product_reviews, ML tables)
</commit_message>
<xml_diff>
--- a/Documentation CZ/Dokumentace CZ 5.0.docx
+++ b/Documentation CZ/Dokumentace CZ 5.0.docx
@@ -22,7 +22,7 @@
     </w:p>
     <w:p>
       <w:r>
-        <w:t>Datum: 2026-04</w:t>
+        <w:t>Datum: 2026-05</w:t>
       </w:r>
     </w:p>
     <w:p>
@@ -314,12 +314,12 @@
     </w:p>
     <w:p>
       <w:r>
-        <w:t>[PLACEHOLDER — bude doplněno po dokončení Power BI reportů]</w:t>
+        <w:t>Power BI report využívá kompozitní model kombinující Import-mode dimenzionální tabulky s DirectQuery fakty a mart tabulkami napojenými na Snowflake. Všechny DAX metriky jsou centralizovány v dedikované tabulce _Measures.</w:t>
       </w:r>
     </w:p>
     <w:p>
       <w:r>
-        <w:t>Tato sekce bude obsahovat:</w:t>
+        <w:t>Struktura sémantického modelu:</w:t>
       </w:r>
     </w:p>
     <w:p>
@@ -327,7 +327,7 @@
         <w:pStyle w:val="ListBullet"/>
       </w:pPr>
       <w:r>
-        <w:t>Popis kompozitního Power BI modelu (Import + DirectQuery)</w:t>
+        <w:t>Import tabulky: DIM_DATE, DIM_PRODUCTS_GOLD (vč. avg_review_score, Review Stars), DIM_EMPLOYEES_GOLD, DIM_PAYROLL_GOLD</w:t>
       </w:r>
     </w:p>
     <w:p>
@@ -335,7 +335,7 @@
         <w:pStyle w:val="ListBullet"/>
       </w:pPr>
       <w:r>
-        <w:t>Přehled pěti dashboard stránek a jejich byznysových otázek</w:t>
+        <w:t>DirectQuery tabulky: FACT_ORDERS_GOLD, MART_MONTHLY_PRODUCT_SALES, MART_CITY_SALES, MART_PRODUCT_REVIEWS, MART_HOURLY_TRAFFIC_CONVERSION, MART_TRAFFIC_CONVERSION_BY_PRODUCT, MART_EMPLOYEE_ADDON_PERFORMANCE</w:t>
       </w:r>
     </w:p>
     <w:p>
@@ -343,7 +343,7 @@
         <w:pStyle w:val="ListBullet"/>
       </w:pPr>
       <w:r>
-        <w:t>DAX metriky a jejich interpretaci</w:t>
+        <w:t>DAX metriky: městské KPI (Revenue, Margin, Orders — YTD vs PY se šipkovými indikátory), metriky recenzí (Avg Review Stars, Review Score Color), tooltip metriky (City Revenue Tooltip By Year / YoY % přes odpojenou tabulku _ToolTip_Years)</w:t>
       </w:r>
     </w:p>
     <w:p>
@@ -351,7 +351,7 @@
         <w:pStyle w:val="ListBullet"/>
       </w:pPr>
       <w:r>
-        <w:t>Screenshot ukázky dashboardů</w:t>
+        <w:t>Dashboard stránky: (1) Sales Overview — KPI karty + měsíční graf příjmů s tooltip srovnáním let; (2) Product Performance — dekompozitní strom + hvězdičky recenzí; (3) Traffic &amp; Conversion; (4) Hourly Patterns; (5) Employee Addon Performance</w:t>
       </w:r>
     </w:p>
     <w:p>
@@ -886,7 +886,7 @@
           </w:tcPr>
           <w:p>
             <w:r>
-              <w:t>jeden řádek na den (2023–2031)</w:t>
+              <w:t>jeden řádek na den (2021–2031)</w:t>
             </w:r>
           </w:p>
         </w:tc>
@@ -896,7 +896,7 @@
           </w:tcPr>
           <w:p>
             <w:r>
-              <w:t>date_day, year, month, quarter, is_weekend</w:t>
+              <w:t>date_day, year, quarter, month, year_quarter, year_month</w:t>
             </w:r>
           </w:p>
         </w:tc>
@@ -928,7 +928,7 @@
           </w:tcPr>
           <w:p>
             <w:r>
-              <w:t>product_id, name, category, subcategory, base_price, unit_cost</w:t>
+              <w:t>product_id, product_name, category, subcategory, brand, base_price, unit_cost, avg_review_score</w:t>
             </w:r>
           </w:p>
         </w:tc>
@@ -1237,6 +1237,134 @@
           <w:p>
             <w:r>
               <w:t>revenue_forecast, revenue_lower, revenue_upper, is_future</w:t>
+            </w:r>
+          </w:p>
+        </w:tc>
+      </w:tr>
+      <w:tr>
+        <w:tc>
+          <w:tcPr>
+            <w:tcW w:type="dxa" w:w="2880"/>
+          </w:tcPr>
+          <w:p>
+            <w:r>
+              <w:t>mart_city_sales</w:t>
+            </w:r>
+          </w:p>
+        </w:tc>
+        <w:tc>
+          <w:tcPr>
+            <w:tcW w:type="dxa" w:w="2880"/>
+          </w:tcPr>
+          <w:p>
+            <w:r>
+              <w:t>město × den</w:t>
+            </w:r>
+          </w:p>
+        </w:tc>
+        <w:tc>
+          <w:tcPr>
+            <w:tcW w:type="dxa" w:w="2880"/>
+          </w:tcPr>
+          <w:p>
+            <w:r>
+              <w:t>total_revenue, total_margin, total_orders, city, region</w:t>
+            </w:r>
+          </w:p>
+        </w:tc>
+      </w:tr>
+      <w:tr>
+        <w:tc>
+          <w:tcPr>
+            <w:tcW w:type="dxa" w:w="2880"/>
+          </w:tcPr>
+          <w:p>
+            <w:r>
+              <w:t>mart_product_reviews</w:t>
+            </w:r>
+          </w:p>
+        </w:tc>
+        <w:tc>
+          <w:tcPr>
+            <w:tcW w:type="dxa" w:w="2880"/>
+          </w:tcPr>
+          <w:p>
+            <w:r>
+              <w:t>měsíc × produkt</w:t>
+            </w:r>
+          </w:p>
+        </w:tc>
+        <w:tc>
+          <w:tcPr>
+            <w:tcW w:type="dxa" w:w="2880"/>
+          </w:tcPr>
+          <w:p>
+            <w:r>
+              <w:t>avg_review, review_count, five_star_count, pct_positive</w:t>
+            </w:r>
+          </w:p>
+        </w:tc>
+      </w:tr>
+      <w:tr>
+        <w:tc>
+          <w:tcPr>
+            <w:tcW w:type="dxa" w:w="2880"/>
+          </w:tcPr>
+          <w:p>
+            <w:r>
+              <w:t>ml_anomaly_flags</w:t>
+            </w:r>
+          </w:p>
+        </w:tc>
+        <w:tc>
+          <w:tcPr>
+            <w:tcW w:type="dxa" w:w="2880"/>
+          </w:tcPr>
+          <w:p>
+            <w:r>
+              <w:t>měsíc × entita</w:t>
+            </w:r>
+          </w:p>
+        </w:tc>
+        <w:tc>
+          <w:tcPr>
+            <w:tcW w:type="dxa" w:w="2880"/>
+          </w:tcPr>
+          <w:p>
+            <w:r>
+              <w:t>z_score, is_anomaly, anomaly_type</w:t>
+            </w:r>
+          </w:p>
+        </w:tc>
+      </w:tr>
+      <w:tr>
+        <w:tc>
+          <w:tcPr>
+            <w:tcW w:type="dxa" w:w="2880"/>
+          </w:tcPr>
+          <w:p>
+            <w:r>
+              <w:t>ml_traffic_prediction</w:t>
+            </w:r>
+          </w:p>
+        </w:tc>
+        <w:tc>
+          <w:tcPr>
+            <w:tcW w:type="dxa" w:w="2880"/>
+          </w:tcPr>
+          <w:p>
+            <w:r>
+              <w:t>hodina × den v týdnu</w:t>
+            </w:r>
+          </w:p>
+        </w:tc>
+        <w:tc>
+          <w:tcPr>
+            <w:tcW w:type="dxa" w:w="2880"/>
+          </w:tcPr>
+          <w:p>
+            <w:r>
+              <w:t>predicted_visits, model_version</w:t>
             </w:r>
           </w:p>
         </w:tc>

</xml_diff>